<commit_message>
Atualiza documentação da API
</commit_message>
<xml_diff>
--- a/Analise-API-Restful Booker.docx
+++ b/Analise-API-Restful Booker.docx
@@ -462,22 +462,7 @@
     </w:p>
     <w:p>
       <w:r>
-        <w:t>1,39 segundos</w:t>
-      </w:r>
-    </w:p>
-    <w:p>
-      <w:pPr>
-        <w:rPr>
-          <w:b/>
-          <w:bCs/>
-        </w:rPr>
-      </w:pPr>
-      <w:r>
-        <w:rPr>
-          <w:b/>
-          <w:bCs/>
-        </w:rPr>
-        <w:t>Evidência:</w:t>
+        <w:t>471ms</w:t>
       </w:r>
     </w:p>
     <w:p>
@@ -895,21 +880,6 @@
       </w:r>
       <w:r>
         <w:t>ms</w:t>
-      </w:r>
-    </w:p>
-    <w:p>
-      <w:pPr>
-        <w:rPr>
-          <w:b/>
-          <w:bCs/>
-        </w:rPr>
-      </w:pPr>
-      <w:r>
-        <w:rPr>
-          <w:b/>
-          <w:bCs/>
-        </w:rPr>
-        <w:t>Evidência:</w:t>
       </w:r>
     </w:p>
     <w:sectPr>

</xml_diff>